<commit_message>
fix: detach Word COM handle cleanly when keep_open is True
</commit_message>
<xml_diff>
--- a/output/unit_1_test_formatted.docx
+++ b/output/unit_1_test_formatted.docx
@@ -2042,6 +2042,7 @@
           <w:b/>
           <w:sz w:val="24"/>
         </w:rPr>
+        <w:lastRenderedPageBreak/>
         <w:t>II. Say the sentences out loud. Then write the words with the sound /f/ and /v/ in the table.</w:t>
       </w:r>
     </w:p>
@@ -2289,7 +2290,7 @@
         <mc:AlternateContent>
           <mc:Choice Requires="wps">
             <w:drawing>
-              <wp:anchor distT="0" distB="0" distL="114300" distR="114300" simplePos="0" relativeHeight="251659264" behindDoc="0" locked="0" layoutInCell="1" allowOverlap="1" wp14:anchorId="6FE66C93" wp14:editId="23114AD1">
+              <wp:anchor distT="0" distB="0" distL="114300" distR="114300" simplePos="0" relativeHeight="251659264" behindDoc="0" locked="0" layoutInCell="1" allowOverlap="1" wp14:anchorId="0121769C" wp14:editId="33A6DAA0">
                 <wp:simplePos x="0" y="0"/>
                 <wp:positionH relativeFrom="margin">
                   <wp:posOffset>683895</wp:posOffset>
@@ -2300,7 +2301,7 @@
                 <wp:extent cx="4572000" cy="762000"/>
                 <wp:effectExtent l="0" t="0" r="19050" b="19050"/>
                 <wp:wrapNone/>
-                <wp:docPr id="1786254832" name="Rectangle: Rounded Corners 1"/>
+                <wp:docPr id="64492795" name="Rectangle: Rounded Corners 1"/>
                 <wp:cNvGraphicFramePr/>
                 <a:graphic xmlns:a="http://schemas.openxmlformats.org/drawingml/2006/main">
                   <a:graphicData uri="http://schemas.microsoft.com/office/word/2010/wordprocessingShape">
@@ -2363,7 +2364,7 @@
           </mc:Choice>
           <mc:Fallback>
             <w:pict>
-              <v:roundrect w14:anchorId="5C7BA58F" id="Rectangle: Rounded Corners 1" o:spid="_x0000_s1026" style="position:absolute;margin-left:53.85pt;margin-top:-6pt;width:5in;height:60pt;z-index:251659264;visibility:visible;mso-wrap-style:square;mso-wrap-distance-left:9pt;mso-wrap-distance-top:0;mso-wrap-distance-right:9pt;mso-wrap-distance-bottom:0;mso-position-horizontal:absolute;mso-position-horizontal-relative:margin;mso-position-vertical:absolute;mso-position-vertical-relative:text;v-text-anchor:middle" arcsize="10923f" o:gfxdata="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" filled="f" fillcolor="#156082 [3204]" strokeweight="1pt">
+              <v:roundrect w14:anchorId="595FE49A" id="Rectangle: Rounded Corners 1" o:spid="_x0000_s1026" style="position:absolute;margin-left:53.85pt;margin-top:-6pt;width:5in;height:60pt;z-index:251659264;visibility:visible;mso-wrap-style:square;mso-wrap-distance-left:9pt;mso-wrap-distance-top:0;mso-wrap-distance-right:9pt;mso-wrap-distance-bottom:0;mso-position-horizontal:absolute;mso-position-horizontal-relative:margin;mso-position-vertical:absolute;mso-position-vertical-relative:text;v-text-anchor:middle" arcsize="10923f" o:gfxdata="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" filled="f" fillcolor="#156082 [3204]" strokeweight="1pt">
                 <v:stroke joinstyle="miter"/>
                 <w10:wrap anchorx="margin"/>
               </v:roundrect>
@@ -3507,7 +3508,7 @@
     <w:link w:val="Heading1Char"/>
     <w:uiPriority w:val="9"/>
     <w:qFormat/>
-    <w:rsid w:val="00A53CDC"/>
+    <w:rsid w:val="00A97A77"/>
     <w:pPr>
       <w:keepNext/>
       <w:keepLines/>
@@ -3530,7 +3531,7 @@
     <w:semiHidden/>
     <w:unhideWhenUsed/>
     <w:qFormat/>
-    <w:rsid w:val="00A53CDC"/>
+    <w:rsid w:val="00A97A77"/>
     <w:pPr>
       <w:keepNext/>
       <w:keepLines/>
@@ -3553,7 +3554,7 @@
     <w:semiHidden/>
     <w:unhideWhenUsed/>
     <w:qFormat/>
-    <w:rsid w:val="00A53CDC"/>
+    <w:rsid w:val="00A97A77"/>
     <w:pPr>
       <w:keepNext/>
       <w:keepLines/>
@@ -3576,7 +3577,7 @@
     <w:semiHidden/>
     <w:unhideWhenUsed/>
     <w:qFormat/>
-    <w:rsid w:val="00A53CDC"/>
+    <w:rsid w:val="00A97A77"/>
     <w:pPr>
       <w:keepNext/>
       <w:keepLines/>
@@ -3599,7 +3600,7 @@
     <w:semiHidden/>
     <w:unhideWhenUsed/>
     <w:qFormat/>
-    <w:rsid w:val="00A53CDC"/>
+    <w:rsid w:val="00A97A77"/>
     <w:pPr>
       <w:keepNext/>
       <w:keepLines/>
@@ -3620,7 +3621,7 @@
     <w:semiHidden/>
     <w:unhideWhenUsed/>
     <w:qFormat/>
-    <w:rsid w:val="00A53CDC"/>
+    <w:rsid w:val="00A97A77"/>
     <w:pPr>
       <w:keepNext/>
       <w:keepLines/>
@@ -3643,7 +3644,7 @@
     <w:semiHidden/>
     <w:unhideWhenUsed/>
     <w:qFormat/>
-    <w:rsid w:val="00A53CDC"/>
+    <w:rsid w:val="00A97A77"/>
     <w:pPr>
       <w:keepNext/>
       <w:keepLines/>
@@ -3664,7 +3665,7 @@
     <w:semiHidden/>
     <w:unhideWhenUsed/>
     <w:qFormat/>
-    <w:rsid w:val="00A53CDC"/>
+    <w:rsid w:val="00A97A77"/>
     <w:pPr>
       <w:keepNext/>
       <w:keepLines/>
@@ -3687,7 +3688,7 @@
     <w:semiHidden/>
     <w:unhideWhenUsed/>
     <w:qFormat/>
-    <w:rsid w:val="00A53CDC"/>
+    <w:rsid w:val="00A97A77"/>
     <w:pPr>
       <w:keepNext/>
       <w:keepLines/>
@@ -3731,7 +3732,7 @@
     <w:basedOn w:val="DefaultParagraphFont"/>
     <w:link w:val="Heading1"/>
     <w:uiPriority w:val="9"/>
-    <w:rsid w:val="00A53CDC"/>
+    <w:rsid w:val="00A97A77"/>
     <w:rPr>
       <w:rFonts w:asciiTheme="majorHAnsi" w:eastAsiaTheme="majorEastAsia" w:hAnsiTheme="majorHAnsi" w:cstheme="majorBidi"/>
       <w:color w:val="0F4761" w:themeColor="accent1" w:themeShade="BF"/>
@@ -3745,7 +3746,7 @@
     <w:link w:val="Heading2"/>
     <w:uiPriority w:val="9"/>
     <w:semiHidden/>
-    <w:rsid w:val="00A53CDC"/>
+    <w:rsid w:val="00A97A77"/>
     <w:rPr>
       <w:rFonts w:asciiTheme="majorHAnsi" w:eastAsiaTheme="majorEastAsia" w:hAnsiTheme="majorHAnsi" w:cstheme="majorBidi"/>
       <w:color w:val="0F4761" w:themeColor="accent1" w:themeShade="BF"/>
@@ -3759,7 +3760,7 @@
     <w:link w:val="Heading3"/>
     <w:uiPriority w:val="9"/>
     <w:semiHidden/>
-    <w:rsid w:val="00A53CDC"/>
+    <w:rsid w:val="00A97A77"/>
     <w:rPr>
       <w:rFonts w:asciiTheme="minorHAnsi" w:eastAsiaTheme="majorEastAsia" w:hAnsiTheme="minorHAnsi" w:cstheme="majorBidi"/>
       <w:color w:val="0F4761" w:themeColor="accent1" w:themeShade="BF"/>
@@ -3773,7 +3774,7 @@
     <w:link w:val="Heading4"/>
     <w:uiPriority w:val="9"/>
     <w:semiHidden/>
-    <w:rsid w:val="00A53CDC"/>
+    <w:rsid w:val="00A97A77"/>
     <w:rPr>
       <w:rFonts w:asciiTheme="minorHAnsi" w:eastAsiaTheme="majorEastAsia" w:hAnsiTheme="minorHAnsi" w:cstheme="majorBidi"/>
       <w:i/>
@@ -3787,7 +3788,7 @@
     <w:link w:val="Heading5"/>
     <w:uiPriority w:val="9"/>
     <w:semiHidden/>
-    <w:rsid w:val="00A53CDC"/>
+    <w:rsid w:val="00A97A77"/>
     <w:rPr>
       <w:rFonts w:asciiTheme="minorHAnsi" w:eastAsiaTheme="majorEastAsia" w:hAnsiTheme="minorHAnsi" w:cstheme="majorBidi"/>
       <w:color w:val="0F4761" w:themeColor="accent1" w:themeShade="BF"/>
@@ -3799,7 +3800,7 @@
     <w:link w:val="Heading6"/>
     <w:uiPriority w:val="9"/>
     <w:semiHidden/>
-    <w:rsid w:val="00A53CDC"/>
+    <w:rsid w:val="00A97A77"/>
     <w:rPr>
       <w:rFonts w:asciiTheme="minorHAnsi" w:eastAsiaTheme="majorEastAsia" w:hAnsiTheme="minorHAnsi" w:cstheme="majorBidi"/>
       <w:i/>
@@ -3813,7 +3814,7 @@
     <w:link w:val="Heading7"/>
     <w:uiPriority w:val="9"/>
     <w:semiHidden/>
-    <w:rsid w:val="00A53CDC"/>
+    <w:rsid w:val="00A97A77"/>
     <w:rPr>
       <w:rFonts w:asciiTheme="minorHAnsi" w:eastAsiaTheme="majorEastAsia" w:hAnsiTheme="minorHAnsi" w:cstheme="majorBidi"/>
       <w:color w:val="595959" w:themeColor="text1" w:themeTint="A6"/>
@@ -3825,7 +3826,7 @@
     <w:link w:val="Heading8"/>
     <w:uiPriority w:val="9"/>
     <w:semiHidden/>
-    <w:rsid w:val="00A53CDC"/>
+    <w:rsid w:val="00A97A77"/>
     <w:rPr>
       <w:rFonts w:asciiTheme="minorHAnsi" w:eastAsiaTheme="majorEastAsia" w:hAnsiTheme="minorHAnsi" w:cstheme="majorBidi"/>
       <w:i/>
@@ -3839,7 +3840,7 @@
     <w:link w:val="Heading9"/>
     <w:uiPriority w:val="9"/>
     <w:semiHidden/>
-    <w:rsid w:val="00A53CDC"/>
+    <w:rsid w:val="00A97A77"/>
     <w:rPr>
       <w:rFonts w:asciiTheme="minorHAnsi" w:eastAsiaTheme="majorEastAsia" w:hAnsiTheme="minorHAnsi" w:cstheme="majorBidi"/>
       <w:color w:val="272727" w:themeColor="text1" w:themeTint="D8"/>
@@ -3852,7 +3853,7 @@
     <w:link w:val="TitleChar"/>
     <w:uiPriority w:val="10"/>
     <w:qFormat/>
-    <w:rsid w:val="00A53CDC"/>
+    <w:rsid w:val="00A97A77"/>
     <w:pPr>
       <w:spacing w:after="80" w:line="240" w:lineRule="auto"/>
       <w:contextualSpacing/>
@@ -3870,7 +3871,7 @@
     <w:basedOn w:val="DefaultParagraphFont"/>
     <w:link w:val="Title"/>
     <w:uiPriority w:val="10"/>
-    <w:rsid w:val="00A53CDC"/>
+    <w:rsid w:val="00A97A77"/>
     <w:rPr>
       <w:rFonts w:asciiTheme="majorHAnsi" w:eastAsiaTheme="majorEastAsia" w:hAnsiTheme="majorHAnsi" w:cstheme="majorBidi"/>
       <w:spacing w:val="-10"/>
@@ -3886,7 +3887,7 @@
     <w:link w:val="SubtitleChar"/>
     <w:uiPriority w:val="11"/>
     <w:qFormat/>
-    <w:rsid w:val="00A53CDC"/>
+    <w:rsid w:val="00A97A77"/>
     <w:pPr>
       <w:numPr>
         <w:ilvl w:val="1"/>
@@ -3905,7 +3906,7 @@
     <w:basedOn w:val="DefaultParagraphFont"/>
     <w:link w:val="Subtitle"/>
     <w:uiPriority w:val="11"/>
-    <w:rsid w:val="00A53CDC"/>
+    <w:rsid w:val="00A97A77"/>
     <w:rPr>
       <w:rFonts w:asciiTheme="minorHAnsi" w:eastAsiaTheme="majorEastAsia" w:hAnsiTheme="minorHAnsi" w:cstheme="majorBidi"/>
       <w:color w:val="595959" w:themeColor="text1" w:themeTint="A6"/>
@@ -3921,7 +3922,7 @@
     <w:link w:val="QuoteChar"/>
     <w:uiPriority w:val="29"/>
     <w:qFormat/>
-    <w:rsid w:val="00A53CDC"/>
+    <w:rsid w:val="00A97A77"/>
     <w:pPr>
       <w:spacing w:before="160"/>
       <w:jc w:val="center"/>
@@ -3937,7 +3938,7 @@
     <w:basedOn w:val="DefaultParagraphFont"/>
     <w:link w:val="Quote"/>
     <w:uiPriority w:val="29"/>
-    <w:rsid w:val="00A53CDC"/>
+    <w:rsid w:val="00A97A77"/>
     <w:rPr>
       <w:i/>
       <w:iCs/>
@@ -3949,7 +3950,7 @@
     <w:basedOn w:val="Normal"/>
     <w:uiPriority w:val="34"/>
     <w:qFormat/>
-    <w:rsid w:val="00A53CDC"/>
+    <w:rsid w:val="00A97A77"/>
     <w:pPr>
       <w:ind w:left="720"/>
       <w:contextualSpacing/>
@@ -3960,7 +3961,7 @@
     <w:basedOn w:val="DefaultParagraphFont"/>
     <w:uiPriority w:val="21"/>
     <w:qFormat/>
-    <w:rsid w:val="00A53CDC"/>
+    <w:rsid w:val="00A97A77"/>
     <w:rPr>
       <w:i/>
       <w:iCs/>
@@ -3974,7 +3975,7 @@
     <w:link w:val="IntenseQuoteChar"/>
     <w:uiPriority w:val="30"/>
     <w:qFormat/>
-    <w:rsid w:val="00A53CDC"/>
+    <w:rsid w:val="00A97A77"/>
     <w:pPr>
       <w:pBdr>
         <w:top w:val="single" w:sz="4" w:space="10" w:color="0F4761" w:themeColor="accent1" w:themeShade="BF"/>
@@ -3995,7 +3996,7 @@
     <w:basedOn w:val="DefaultParagraphFont"/>
     <w:link w:val="IntenseQuote"/>
     <w:uiPriority w:val="30"/>
-    <w:rsid w:val="00A53CDC"/>
+    <w:rsid w:val="00A97A77"/>
     <w:rPr>
       <w:i/>
       <w:iCs/>
@@ -4007,7 +4008,7 @@
     <w:basedOn w:val="DefaultParagraphFont"/>
     <w:uiPriority w:val="32"/>
     <w:qFormat/>
-    <w:rsid w:val="00A53CDC"/>
+    <w:rsid w:val="00A97A77"/>
     <w:rPr>
       <w:b/>
       <w:bCs/>
@@ -4022,7 +4023,7 @@
     <w:link w:val="HeaderChar"/>
     <w:uiPriority w:val="99"/>
     <w:unhideWhenUsed/>
-    <w:rsid w:val="00A53CDC"/>
+    <w:rsid w:val="00A97A77"/>
     <w:pPr>
       <w:tabs>
         <w:tab w:val="center" w:pos="4680"/>
@@ -4036,7 +4037,7 @@
     <w:basedOn w:val="DefaultParagraphFont"/>
     <w:link w:val="Header"/>
     <w:uiPriority w:val="99"/>
-    <w:rsid w:val="00A53CDC"/>
+    <w:rsid w:val="00A97A77"/>
   </w:style>
   <w:style w:type="paragraph" w:styleId="Footer">
     <w:name w:val="footer"/>
@@ -4044,7 +4045,7 @@
     <w:link w:val="FooterChar"/>
     <w:uiPriority w:val="99"/>
     <w:unhideWhenUsed/>
-    <w:rsid w:val="00A53CDC"/>
+    <w:rsid w:val="00A97A77"/>
     <w:pPr>
       <w:tabs>
         <w:tab w:val="center" w:pos="4680"/>
@@ -4058,7 +4059,7 @@
     <w:basedOn w:val="DefaultParagraphFont"/>
     <w:link w:val="Footer"/>
     <w:uiPriority w:val="99"/>
-    <w:rsid w:val="00A53CDC"/>
+    <w:rsid w:val="00A97A77"/>
   </w:style>
 </w:styles>
 </file>

</xml_diff>